<commit_message>
Corriger représentants Agence Ludys et lieu de signature
Timothée MARTIN en Président avec Annaël LE NY (les deux dirigeants),
fait à Inzinzac-Lochrist.

Co-authored-by: antoinelebofficiel <antoinelebofficiel@users.noreply.github.com>
</commit_message>
<xml_diff>
--- a/Contrat_Apporteur_Affaires_LUDYS_VIDEOS_Antoine_Bauche.docx
+++ b/Contrat_Apporteur_Affaires_LUDYS_VIDEOS_Antoine_Bauche.docx
@@ -40,96 +40,72 @@
         <w:jc w:val="both"/>
       </w:pPr>
       <w:r>
-        <w:t xml:space="preserve">La société </w:t>
-      </w:r>
-      <w:r>
-        <w:rPr>
-          <w:b/>
-          <w:bCs/>
-          <w:shd w:fill="FFF2CC" w:val="clear"/>
-        </w:rPr>
-        <w:t xml:space="preserve">LUDYS VIDEOS</w:t>
-      </w:r>
-      <w:r>
-        <w:t xml:space="preserve">, </w:t>
-      </w:r>
-      <w:r>
-        <w:rPr>
-          <w:b/>
-          <w:bCs/>
-          <w:shd w:fill="FFF2CC" w:val="clear"/>
-        </w:rPr>
-        <w:t xml:space="preserve">Société par Actions Simplifiée (SAS)</w:t>
-      </w:r>
-      <w:r>
-        <w:t xml:space="preserve"> au capital de </w:t>
-      </w:r>
-      <w:r>
-        <w:rPr>
-          <w:b/>
-          <w:bCs/>
-          <w:shd w:fill="FFF2CC" w:val="clear"/>
-        </w:rPr>
-        <w:t xml:space="preserve">3 000</w:t>
-      </w:r>
-      <w:r>
-        <w:t xml:space="preserve"> €, immatriculée au Registre du Commerce et des Sociétés de </w:t>
-      </w:r>
-      <w:r>
-        <w:rPr>
-          <w:b/>
-          <w:bCs/>
-          <w:shd w:fill="FFF2CC" w:val="clear"/>
-        </w:rPr>
-        <w:t xml:space="preserve">Brest</w:t>
-      </w:r>
-      <w:r>
-        <w:t xml:space="preserve"> sous le numéro SIRET </w:t>
-      </w:r>
-      <w:r>
-        <w:rPr>
-          <w:b/>
-          <w:bCs/>
-          <w:shd w:fill="FFF2CC" w:val="clear"/>
-        </w:rPr>
-        <w:t xml:space="preserve">824 067 326 00036</w:t>
-      </w:r>
-      <w:r>
-        <w:t xml:space="preserve">, dont le siège social est situé </w:t>
-      </w:r>
-      <w:r>
-        <w:rPr>
-          <w:b/>
-          <w:bCs/>
-          <w:shd w:fill="FFF2CC" w:val="clear"/>
-        </w:rPr>
-        <w:t xml:space="preserve">3 rue du Bois d'Amour, 29200 Brest</w:t>
-      </w:r>
-      <w:r>
-        <w:t xml:space="preserve">, représentée par </w:t>
-      </w:r>
-      <w:r>
-        <w:rPr>
-          <w:b/>
-          <w:bCs/>
-          <w:shd w:fill="FFF2CC" w:val="clear"/>
-        </w:rPr>
-        <w:t xml:space="preserve">Annaël LE NY</w:t>
-      </w:r>
-      <w:r>
-        <w:t xml:space="preserve">, agissant en qualité de </w:t>
-      </w:r>
-      <w:r>
-        <w:rPr>
-          <w:b/>
-          <w:bCs/>
-          <w:shd w:fill="FFF2CC" w:val="clear"/>
-        </w:rPr>
-        <w:t xml:space="preserve">Président</w:t>
-      </w:r>
-      <w:r>
-        <w:t xml:space="preserve"> et dûment habilité(e) aux fins des présentes,</w:t>
-      </w:r>
+        <w:t>La société LUDYS VIDEOS, exerçant sous le nom commercial Agence Ludys, Société par Actions Simplifiée (SAS) au capital de 3 000 €, immatriculée au Registre du Commerce et des Sociétés de Brest sous le numéro SIRET 824 067 326 00036, dont le siège social est situé 3 rue du Bois d'Amour, 29200 Brest, représentée par Timothée MARTIN, agissant en qualité de Président, et Annaël LE NY, dûment habilités aux fins des présentes,</w:t>
+      </w:r>
+      <w:r>
+        <w:rPr>
+          <w:b/>
+          <w:bCs/>
+          <w:shd w:fill="FFF2CC" w:val="clear"/>
+        </w:rPr>
+      </w:r>
+      <w:r/>
+      <w:r>
+        <w:rPr>
+          <w:b/>
+          <w:bCs/>
+          <w:shd w:fill="FFF2CC" w:val="clear"/>
+        </w:rPr>
+      </w:r>
+      <w:r/>
+      <w:r>
+        <w:rPr>
+          <w:b/>
+          <w:bCs/>
+          <w:shd w:fill="FFF2CC" w:val="clear"/>
+        </w:rPr>
+      </w:r>
+      <w:r/>
+      <w:r>
+        <w:rPr>
+          <w:b/>
+          <w:bCs/>
+          <w:shd w:fill="FFF2CC" w:val="clear"/>
+        </w:rPr>
+      </w:r>
+      <w:r/>
+      <w:r>
+        <w:rPr>
+          <w:b/>
+          <w:bCs/>
+          <w:shd w:fill="FFF2CC" w:val="clear"/>
+        </w:rPr>
+      </w:r>
+      <w:r/>
+      <w:r>
+        <w:rPr>
+          <w:b/>
+          <w:bCs/>
+          <w:shd w:fill="FFF2CC" w:val="clear"/>
+        </w:rPr>
+      </w:r>
+      <w:r/>
+      <w:r>
+        <w:rPr>
+          <w:b/>
+          <w:bCs/>
+          <w:shd w:fill="FFF2CC" w:val="clear"/>
+        </w:rPr>
+      </w:r>
+      <w:r/>
+      <w:r>
+        <w:rPr>
+          <w:b/>
+          <w:bCs/>
+          <w:shd w:fill="FFF2CC" w:val="clear"/>
+        </w:rPr>
+      </w:r>
+      <w:r/>
     </w:p>
     <w:p>
       <w:pPr>
@@ -627,7 +603,7 @@
         <w:jc w:val="both"/>
       </w:pPr>
       <w:r>
-        <w:t>Fait à Brest,</w:t>
+        <w:t>Fait à Inzinzac-Lochrist,</w:t>
       </w:r>
     </w:p>
     <w:p>
@@ -681,42 +657,33 @@
           </w:tcPr>
           <w:p>
             <w:r>
-              <w:rPr>
-                <w:b/>
-                <w:bCs/>
-              </w:rPr>
-              <w:t xml:space="preserve">Pour la Société</w:t>
-            </w:r>
-          </w:p>
-          <w:p>
-            <w:pPr>
-              <w:spacing w:before="80"/>
-            </w:pPr>
-            <w:r>
-              <w:rPr>
-                <w:b/>
-                <w:bCs/>
-                <w:shd w:fill="FFF2CC" w:val="clear"/>
-              </w:rPr>
-              <w:t xml:space="preserve">Annaël LE NY</w:t>
+              <w:t>Pour la Société — Agence Ludys (LUDYS VIDEOS)</w:t>
             </w:r>
           </w:p>
           <w:p>
             <w:r>
-              <w:rPr>
-                <w:b/>
-                <w:bCs/>
-                <w:shd w:fill="FFF2CC" w:val="clear"/>
-              </w:rPr>
-              <w:t xml:space="preserve">Président de LUDYS VIDEOS</w:t>
+              <w:t>Timothée MARTIN</w:t>
             </w:r>
           </w:p>
           <w:p>
-            <w:pPr>
-              <w:spacing w:before="600"/>
-            </w:pPr>
             <w:r>
-              <w:t xml:space="preserve">Signature :</w:t>
+              <w:t>Président</w:t>
+            </w:r>
+          </w:p>
+          <w:p>
+            <w:r>
+              <w:t>Signature :</w:t>
+            </w:r>
+          </w:p>
+          <w:p/>
+          <w:p>
+            <w:r>
+              <w:t>Annaël LE NY</w:t>
+            </w:r>
+          </w:p>
+          <w:p>
+            <w:r>
+              <w:t>Signature :</w:t>
             </w:r>
           </w:p>
         </w:tc>

</xml_diff>

<commit_message>
Retirer le nom commercial Agence Ludys, conserver LUDYS VIDEOS
Co-authored-by: antoinelebofficiel <antoinelebofficiel@users.noreply.github.com>
</commit_message>
<xml_diff>
--- a/Contrat_Apporteur_Affaires_LUDYS_VIDEOS_Antoine_Bauche.docx
+++ b/Contrat_Apporteur_Affaires_LUDYS_VIDEOS_Antoine_Bauche.docx
@@ -40,7 +40,7 @@
         <w:jc w:val="both"/>
       </w:pPr>
       <w:r>
-        <w:t>La société LUDYS VIDEOS, exerçant sous le nom commercial Agence Ludys, Société par Actions Simplifiée (SAS) au capital de 3 000 €, immatriculée au Registre du Commerce et des Sociétés de Brest sous le numéro SIRET 824 067 326 00036, dont le siège social est situé 3 rue du Bois d'Amour, 29200 Brest, représentée par Timothée MARTIN, agissant en qualité de Président, et Annaël LE NY, dûment habilités aux fins des présentes,</w:t>
+        <w:t>La société LUDYS VIDEOS, Société par Actions Simplifiée (SAS) au capital de 3 000 €, immatriculée au Registre du Commerce et des Sociétés de Brest sous le numéro SIRET 824 067 326 00036, dont le siège social est situé 3 rue du Bois d'Amour, 29200 Brest, représentée par Timothée MARTIN, agissant en qualité de Président, et Annaël LE NY, dûment habilités aux fins des présentes,</w:t>
       </w:r>
       <w:r>
         <w:rPr>
@@ -657,7 +657,7 @@
           </w:tcPr>
           <w:p>
             <w:r>
-              <w:t>Pour la Société — Agence Ludys (LUDYS VIDEOS)</w:t>
+              <w:t>Pour la Société — LUDYS VIDEOS</w:t>
             </w:r>
           </w:p>
           <w:p>

</xml_diff>

<commit_message>
Retirer les surlignages jaunes du contrat et régénérer le PDF
Co-authored-by: antoinelebofficiel <antoinelebofficiel@users.noreply.github.com>
</commit_message>
<xml_diff>
--- a/Contrat_Apporteur_Affaires_LUDYS_VIDEOS_Antoine_Bauche.docx
+++ b/Contrat_Apporteur_Affaires_LUDYS_VIDEOS_Antoine_Bauche.docx
@@ -46,63 +46,55 @@
         <w:rPr>
           <w:b/>
           <w:bCs/>
-          <w:shd w:fill="FFF2CC" w:val="clear"/>
-        </w:rPr>
-      </w:r>
-      <w:r/>
-      <w:r>
-        <w:rPr>
-          <w:b/>
-          <w:bCs/>
-          <w:shd w:fill="FFF2CC" w:val="clear"/>
-        </w:rPr>
-      </w:r>
-      <w:r/>
-      <w:r>
-        <w:rPr>
-          <w:b/>
-          <w:bCs/>
-          <w:shd w:fill="FFF2CC" w:val="clear"/>
-        </w:rPr>
-      </w:r>
-      <w:r/>
-      <w:r>
-        <w:rPr>
-          <w:b/>
-          <w:bCs/>
-          <w:shd w:fill="FFF2CC" w:val="clear"/>
-        </w:rPr>
-      </w:r>
-      <w:r/>
-      <w:r>
-        <w:rPr>
-          <w:b/>
-          <w:bCs/>
-          <w:shd w:fill="FFF2CC" w:val="clear"/>
-        </w:rPr>
-      </w:r>
-      <w:r/>
-      <w:r>
-        <w:rPr>
-          <w:b/>
-          <w:bCs/>
-          <w:shd w:fill="FFF2CC" w:val="clear"/>
-        </w:rPr>
-      </w:r>
-      <w:r/>
-      <w:r>
-        <w:rPr>
-          <w:b/>
-          <w:bCs/>
-          <w:shd w:fill="FFF2CC" w:val="clear"/>
-        </w:rPr>
-      </w:r>
-      <w:r/>
-      <w:r>
-        <w:rPr>
-          <w:b/>
-          <w:bCs/>
-          <w:shd w:fill="FFF2CC" w:val="clear"/>
+        </w:rPr>
+      </w:r>
+      <w:r/>
+      <w:r>
+        <w:rPr>
+          <w:b/>
+          <w:bCs/>
+        </w:rPr>
+      </w:r>
+      <w:r/>
+      <w:r>
+        <w:rPr>
+          <w:b/>
+          <w:bCs/>
+        </w:rPr>
+      </w:r>
+      <w:r/>
+      <w:r>
+        <w:rPr>
+          <w:b/>
+          <w:bCs/>
+        </w:rPr>
+      </w:r>
+      <w:r/>
+      <w:r>
+        <w:rPr>
+          <w:b/>
+          <w:bCs/>
+        </w:rPr>
+      </w:r>
+      <w:r/>
+      <w:r>
+        <w:rPr>
+          <w:b/>
+          <w:bCs/>
+        </w:rPr>
+      </w:r>
+      <w:r/>
+      <w:r>
+        <w:rPr>
+          <w:b/>
+          <w:bCs/>
+        </w:rPr>
+      </w:r>
+      <w:r/>
+      <w:r>
+        <w:rPr>
+          <w:b/>
+          <w:bCs/>
         </w:rPr>
       </w:r>
       <w:r/>
@@ -143,7 +135,6 @@
         <w:rPr>
           <w:b/>
           <w:bCs/>
-          <w:shd w:fill="FFF2CC" w:val="clear"/>
         </w:rPr>
         <w:t>Antoine Bauché, exerçant à titre indépendant sous le statut de micro-entrepreneur (auto-entrepreneur), immatriculé sous le numéro SIRET 901 172 247 00016, domicilié à Kermeillour, 56500 Bignan,</w:t>
       </w:r>
@@ -152,15 +143,13 @@
         <w:rPr>
           <w:b/>
           <w:bCs/>
-          <w:shd w:fill="FFF2CC" w:val="clear"/>
-        </w:rPr>
-      </w:r>
-      <w:r/>
-      <w:r>
-        <w:rPr>
-          <w:b/>
-          <w:bCs/>
-          <w:shd w:fill="FFF2CC" w:val="clear"/>
+        </w:rPr>
+      </w:r>
+      <w:r/>
+      <w:r>
+        <w:rPr>
+          <w:b/>
+          <w:bCs/>
         </w:rPr>
       </w:r>
       <w:r/>
@@ -303,7 +292,6 @@
         <w:rPr>
           <w:b/>
           <w:bCs/>
-          <w:shd w:fill="FFF2CC" w:val="clear"/>
         </w:rPr>
         <w:t xml:space="preserve">Tout contrat commercial conclu avec un client apporté par l'Apporteur d'affaires, quel que soit son objet ou son montant.</w:t>
       </w:r>
@@ -320,7 +308,6 @@
         <w:rPr>
           <w:b/>
           <w:bCs/>
-          <w:shd w:fill="FFF2CC" w:val="clear"/>
         </w:rPr>
         <w:t xml:space="preserve">Aucun plafond. Aucune validation préalable de la Société n'est requise.</w:t>
       </w:r>
@@ -337,7 +324,6 @@
         <w:rPr>
           <w:b/>
           <w:bCs/>
-          <w:shd w:fill="FFF2CC" w:val="clear"/>
         </w:rPr>
       </w:r>
     </w:p>
@@ -506,7 +492,6 @@
         <w:rPr>
           <w:b/>
           <w:bCs/>
-          <w:shd w:fill="FFF2CC" w:val="clear"/>
         </w:rPr>
         <w:t xml:space="preserve">Le présent contrat n'est pas reconductible tacitement. À son échéance, il prend fin de plein droit, sauf accord exprès et écrit des Parties sur un nouveau contrat, à renégocier avant le terme.</w:t>
       </w:r>
@@ -615,7 +600,6 @@
         <w:rPr>
           <w:b/>
           <w:bCs/>
-          <w:shd w:fill="FFF2CC" w:val="clear"/>
         </w:rPr>
         <w:t>le 7 août 2026, en deux exemplaires originaux.</w:t>
       </w:r>
@@ -624,7 +608,6 @@
         <w:rPr>
           <w:b/>
           <w:bCs/>
-          <w:shd w:fill="FFF2CC" w:val="clear"/>
         </w:rPr>
       </w:r>
       <w:r/>
@@ -708,7 +691,6 @@
               <w:rPr>
                 <w:b/>
                 <w:bCs/>
-                <w:shd w:fill="FFF2CC" w:val="clear"/>
               </w:rPr>
               <w:t xml:space="preserve">Antoine Bauché</w:t>
             </w:r>

</xml_diff>

<commit_message>
Retirer le gras du contrat et régénérer le PDF
Co-authored-by: antoinelebofficiel <antoinelebofficiel@users.noreply.github.com>
</commit_message>
<xml_diff>
--- a/Contrat_Apporteur_Affaires_LUDYS_VIDEOS_Antoine_Bauche.docx
+++ b/Contrat_Apporteur_Affaires_LUDYS_VIDEOS_Antoine_Bauche.docx
@@ -43,59 +43,35 @@
         <w:t>La société LUDYS VIDEOS, Société par Actions Simplifiée (SAS) au capital de 3 000 €, immatriculée au Registre du Commerce et des Sociétés de Brest sous le numéro SIRET 824 067 326 00036, dont le siège social est situé 3 rue du Bois d'Amour, 29200 Brest, représentée par Timothée MARTIN, agissant en qualité de Président, et Annaël LE NY, dûment habilités aux fins des présentes,</w:t>
       </w:r>
       <w:r>
-        <w:rPr>
-          <w:b/>
-          <w:bCs/>
-        </w:rPr>
-      </w:r>
-      <w:r/>
-      <w:r>
-        <w:rPr>
-          <w:b/>
-          <w:bCs/>
-        </w:rPr>
-      </w:r>
-      <w:r/>
-      <w:r>
-        <w:rPr>
-          <w:b/>
-          <w:bCs/>
-        </w:rPr>
-      </w:r>
-      <w:r/>
-      <w:r>
-        <w:rPr>
-          <w:b/>
-          <w:bCs/>
-        </w:rPr>
-      </w:r>
-      <w:r/>
-      <w:r>
-        <w:rPr>
-          <w:b/>
-          <w:bCs/>
-        </w:rPr>
-      </w:r>
-      <w:r/>
-      <w:r>
-        <w:rPr>
-          <w:b/>
-          <w:bCs/>
-        </w:rPr>
-      </w:r>
-      <w:r/>
-      <w:r>
-        <w:rPr>
-          <w:b/>
-          <w:bCs/>
-        </w:rPr>
-      </w:r>
-      <w:r/>
-      <w:r>
-        <w:rPr>
-          <w:b/>
-          <w:bCs/>
-        </w:rPr>
+        <w:rPr/>
+      </w:r>
+      <w:r/>
+      <w:r>
+        <w:rPr/>
+      </w:r>
+      <w:r/>
+      <w:r>
+        <w:rPr/>
+      </w:r>
+      <w:r/>
+      <w:r>
+        <w:rPr/>
+      </w:r>
+      <w:r/>
+      <w:r>
+        <w:rPr/>
+      </w:r>
+      <w:r/>
+      <w:r>
+        <w:rPr/>
+      </w:r>
+      <w:r/>
+      <w:r>
+        <w:rPr/>
+      </w:r>
+      <w:r/>
+      <w:r>
+        <w:rPr/>
       </w:r>
       <w:r/>
     </w:p>
@@ -132,25 +108,16 @@
         <w:jc w:val="both"/>
       </w:pPr>
       <w:r>
-        <w:rPr>
-          <w:b/>
-          <w:bCs/>
-        </w:rPr>
+        <w:rPr/>
         <w:t>Antoine Bauché, exerçant à titre indépendant sous le statut de micro-entrepreneur (auto-entrepreneur), immatriculé sous le numéro SIRET 901 172 247 00016, domicilié à Kermeillour, 56500 Bignan,</w:t>
       </w:r>
       <w:r/>
       <w:r>
-        <w:rPr>
-          <w:b/>
-          <w:bCs/>
-        </w:rPr>
-      </w:r>
-      <w:r/>
-      <w:r>
-        <w:rPr>
-          <w:b/>
-          <w:bCs/>
-        </w:rPr>
+        <w:rPr/>
+      </w:r>
+      <w:r/>
+      <w:r>
+        <w:rPr/>
       </w:r>
       <w:r/>
     </w:p>
@@ -289,10 +256,7 @@
         <w:t xml:space="preserve">Périmètre du mandat : </w:t>
       </w:r>
       <w:r>
-        <w:rPr>
-          <w:b/>
-          <w:bCs/>
-        </w:rPr>
+        <w:rPr/>
         <w:t xml:space="preserve">Tout contrat commercial conclu avec un client apporté par l'Apporteur d'affaires, quel que soit son objet ou son montant.</w:t>
       </w:r>
     </w:p>
@@ -305,10 +269,7 @@
         <w:t xml:space="preserve">Plafond éventuel : </w:t>
       </w:r>
       <w:r>
-        <w:rPr>
-          <w:b/>
-          <w:bCs/>
-        </w:rPr>
+        <w:rPr/>
         <w:t xml:space="preserve">Aucun plafond. Aucune validation préalable de la Société n'est requise.</w:t>
       </w:r>
     </w:p>
@@ -321,10 +282,7 @@
         <w:t>Conditions imposées : L'Apporteur d'affaires s'engage à respecter les conditions commerciales, tarifaires et de paiement définies par la Société et communiquées préalablement par écrit (y compris par voie électronique). Sous cette réserve, aucun autre formalisme préalable n'est requis pour la signature des contrats relevant du périmètre du mandat.</w:t>
       </w:r>
       <w:r>
-        <w:rPr>
-          <w:b/>
-          <w:bCs/>
-        </w:rPr>
+        <w:rPr/>
       </w:r>
     </w:p>
     <w:p>
@@ -489,10 +447,7 @@
         <w:t xml:space="preserve">Renouvellement : </w:t>
       </w:r>
       <w:r>
-        <w:rPr>
-          <w:b/>
-          <w:bCs/>
-        </w:rPr>
+        <w:rPr/>
         <w:t xml:space="preserve">Le présent contrat n'est pas reconductible tacitement. À son échéance, il prend fin de plein droit, sauf accord exprès et écrit des Parties sur un nouveau contrat, à renégocier avant le terme.</w:t>
       </w:r>
     </w:p>
@@ -597,18 +552,12 @@
         <w:jc w:val="both"/>
       </w:pPr>
       <w:r>
-        <w:rPr>
-          <w:b/>
-          <w:bCs/>
-        </w:rPr>
+        <w:rPr/>
         <w:t>le 7 août 2026, en deux exemplaires originaux.</w:t>
       </w:r>
       <w:r/>
       <w:r>
-        <w:rPr>
-          <w:b/>
-          <w:bCs/>
-        </w:rPr>
+        <w:rPr/>
       </w:r>
       <w:r/>
     </w:p>
@@ -676,10 +625,7 @@
           </w:tcPr>
           <w:p>
             <w:r>
-              <w:rPr>
-                <w:b/>
-                <w:bCs/>
-              </w:rPr>
+              <w:rPr/>
               <w:t xml:space="preserve">Pour l'Apporteur d'affaires</w:t>
             </w:r>
           </w:p>
@@ -688,10 +634,7 @@
               <w:spacing w:before="80"/>
             </w:pPr>
             <w:r>
-              <w:rPr>
-                <w:b/>
-                <w:bCs/>
-              </w:rPr>
+              <w:rPr/>
               <w:t xml:space="preserve">Antoine Bauché</w:t>
             </w:r>
           </w:p>

</xml_diff>

<commit_message>
Ne conserver que la signature de Timothée MARTIN pour LUDYS VIDEOS
Co-authored-by: antoinelebofficiel <antoinelebofficiel@users.noreply.github.com>
</commit_message>
<xml_diff>
--- a/Contrat_Apporteur_Affaires_LUDYS_VIDEOS_Antoine_Bauche.docx
+++ b/Contrat_Apporteur_Affaires_LUDYS_VIDEOS_Antoine_Bauche.docx
@@ -40,7 +40,7 @@
         <w:jc w:val="both"/>
       </w:pPr>
       <w:r>
-        <w:t>La société LUDYS VIDEOS, Société par Actions Simplifiée (SAS) au capital de 3 000 €, immatriculée au Registre du Commerce et des Sociétés de Brest sous le numéro SIRET 824 067 326 00036, dont le siège social est situé 3 rue du Bois d'Amour, 29200 Brest, représentée par Timothée MARTIN, agissant en qualité de Président, et Annaël LE NY, dûment habilités aux fins des présentes,</w:t>
+        <w:t>La société LUDYS VIDEOS, Société par Actions Simplifiée (SAS) au capital de 3 000 €, immatriculée au Registre du Commerce et des Sociétés de Brest sous le numéro SIRET 824 067 326 00036, dont le siège social est situé 3 rue du Bois d'Amour, 29200 Brest, représentée par Timothée MARTIN, agissant en qualité de Président et dûment habilité aux fins des présentes,</w:t>
       </w:r>
       <w:r>
         <w:rPr/>
@@ -600,17 +600,6 @@
           <w:p>
             <w:r>
               <w:t>Président</w:t>
-            </w:r>
-          </w:p>
-          <w:p>
-            <w:r>
-              <w:t>Signature :</w:t>
-            </w:r>
-          </w:p>
-          <w:p/>
-          <w:p>
-            <w:r>
-              <w:t>Annaël LE NY</w:t>
             </w:r>
           </w:p>
           <w:p>

</xml_diff>